<commit_message>
Fix Word-rejected DOCX packages and gate builds against regressions
The bundled template carried OOXML conformance defects that made Word
report generated files as corrupted: an unbound dcterms prefix in core
properties, undeclared mc:Ignorable prefixes in header/footer, a missing
w:gutter, out-of-order sectPr and BlockText/rPr children, an empty
dangling comments part, and a w:updateFields flag that popped a
field-update prompt. Package transforms also ran through stdlib
ElementTree, which rewrites prefixes to ns0/ns1 and reintroduces those
defects on every build.

Repair the template, require lxml for reserialization, and add a
word_compat gate in the build path that rejects malformed packages
before they are written.

Generated with [Devin](https://devin.ai)

Co-Authored-By: Devin <158243242+devin-ai-integration[bot]@users.noreply.github.com>
</commit_message>
<xml_diff>
--- a/template/report-style.docx
+++ b/template/report-style.docx
@@ -1,107 +1,103 @@
 
 <file path=word/document.xml><?xml version="1.0" encoding="utf-8"?>
-<w:document xmlns:w="http://schemas.openxmlformats.org/wordprocessingml/2006/main" xmlns:m="http://schemas.openxmlformats.org/officeDocument/2006/math" xmlns:r="http://schemas.openxmlformats.org/officeDocument/2006/relationships" xmlns:o="urn:schemas-microsoft-com:office:office" xmlns:v="urn:schemas-microsoft-com:vml" xmlns:w10="urn:schemas-microsoft-com:office:word" xmlns:a="http://schemas.openxmlformats.org/drawingml/2006/main" xmlns:pic="http://schemas.openxmlformats.org/drawingml/2006/picture" xmlns:wp="http://schemas.openxmlformats.org/drawingml/2006/wordprocessingDrawing">
+<w:document xmlns:r="http://schemas.openxmlformats.org/officeDocument/2006/relationships" xmlns:w="http://schemas.openxmlformats.org/wordprocessingml/2006/main">
   <w:body>
     <w:sectPr>
+      <w:headerReference r:id="rId10" w:type="default"/>
       <w:footerReference r:id="rId9" w:type="default"/>
-      <w:headerReference r:id="rId10" w:type="default"/>
       <w:footnotePr>
         <w:numRestart w:val="eachSect"/>
       </w:footnotePr>
       <w:pgSz w:h="16838" w:w="11906"/>
-      <w:pgMar w:bottom="1417" w:footer="709" w:header="709" w:left="1417" w:right="1417" w:top="1417"/>
+      <w:pgMar w:gutter="0" w:bottom="1417" w:footer="709" w:header="709" w:left="1417" w:right="1417" w:top="1417"/>
     </w:sectPr>
   </w:body>
 </w:document>
 </file>
 
-<file path=word/comments.xml><?xml version="1.0" encoding="utf-8"?>
-<ns0:comments xmlns:ns0="http://schemas.openxmlformats.org/wordprocessingml/2006/main"/>
-</file>
-
 <file path=word/footer1.xml><?xml version="1.0" encoding="utf-8"?>
-<ns0:ftr xmlns:ns0="http://schemas.openxmlformats.org/wordprocessingml/2006/main" xmlns:ns1="http://schemas.openxmlformats.org/markup-compatibility/2006" ns1:Ignorable="w14 wp14">
-  <ns0:p>
-    <ns0:pPr>
-      <ns0:pStyle ns0:val="Footer"/>
-      <ns0:jc ns0:val="center"/>
-    </ns0:pPr>
-    <ns0:r>
-      <ns0:rPr>
-        <ns0:rFonts ns0:ascii="Malgun Gothic" ns0:hAnsi="Malgun Gothic" ns0:eastAsia="Malgun Gothic" ns0:cs="Malgun Gothic"/>
-        <ns0:sz ns0:val="18"/>
-        <ns0:szCs ns0:val="18"/>
-        <ns0:lang ns0:val="en-US" ns0:eastAsia="ko-KR"/>
-      </ns0:rPr>
-      <ns0:fldChar ns0:fldCharType="begin"/>
-    </ns0:r>
-    <ns0:r>
-      <ns0:rPr>
-        <ns0:rFonts ns0:ascii="Malgun Gothic" ns0:hAnsi="Malgun Gothic" ns0:eastAsia="Malgun Gothic" ns0:cs="Malgun Gothic"/>
-        <ns0:sz ns0:val="18"/>
-        <ns0:szCs ns0:val="18"/>
-        <ns0:lang ns0:val="en-US" ns0:eastAsia="ko-KR"/>
-      </ns0:rPr>
-      <ns0:instrText xml:space="preserve"> PAGE </ns0:instrText>
-    </ns0:r>
-    <ns0:r>
-      <ns0:rPr>
-        <ns0:rFonts ns0:ascii="Malgun Gothic" ns0:hAnsi="Malgun Gothic" ns0:eastAsia="Malgun Gothic" ns0:cs="Malgun Gothic"/>
-        <ns0:sz ns0:val="18"/>
-        <ns0:szCs ns0:val="18"/>
-        <ns0:lang ns0:val="en-US" ns0:eastAsia="ko-KR"/>
-      </ns0:rPr>
-      <ns0:fldChar ns0:fldCharType="separate"/>
-    </ns0:r>
-    <ns0:r>
-      <ns0:rPr>
-        <ns0:rFonts ns0:ascii="Malgun Gothic" ns0:hAnsi="Malgun Gothic" ns0:eastAsia="Malgun Gothic" ns0:cs="Malgun Gothic"/>
-        <ns0:sz ns0:val="18"/>
-        <ns0:szCs ns0:val="18"/>
-        <ns0:lang ns0:val="en-US" ns0:eastAsia="ko-KR"/>
-      </ns0:rPr>
-      <ns0:t/>
-    </ns0:r>
-    <ns0:r>
-      <ns0:rPr>
-        <ns0:rFonts ns0:ascii="Malgun Gothic" ns0:hAnsi="Malgun Gothic" ns0:eastAsia="Malgun Gothic" ns0:cs="Malgun Gothic"/>
-        <ns0:sz ns0:val="18"/>
-        <ns0:szCs ns0:val="18"/>
-        <ns0:lang ns0:val="en-US" ns0:eastAsia="ko-KR"/>
-      </ns0:rPr>
-      <ns0:fldChar ns0:fldCharType="end"/>
-    </ns0:r>
-  </ns0:p>
-</ns0:ftr>
+<w:ftr xmlns:w="http://schemas.openxmlformats.org/wordprocessingml/2006/main">
+  <w:p>
+    <w:pPr>
+      <w:pStyle w:val="Footer"/>
+      <w:jc w:val="center"/>
+    </w:pPr>
+    <w:r>
+      <w:rPr>
+        <w:rFonts w:ascii="Malgun Gothic" w:hAnsi="Malgun Gothic" w:eastAsia="Malgun Gothic" w:cs="Malgun Gothic"/>
+        <w:sz w:val="18"/>
+        <w:szCs w:val="18"/>
+        <w:lang w:val="en-US" w:eastAsia="ko-KR"/>
+      </w:rPr>
+      <w:fldChar w:fldCharType="begin"/>
+    </w:r>
+    <w:r>
+      <w:rPr>
+        <w:rFonts w:ascii="Malgun Gothic" w:hAnsi="Malgun Gothic" w:eastAsia="Malgun Gothic" w:cs="Malgun Gothic"/>
+        <w:sz w:val="18"/>
+        <w:szCs w:val="18"/>
+        <w:lang w:val="en-US" w:eastAsia="ko-KR"/>
+      </w:rPr>
+      <w:instrText xml:space="preserve"> PAGE </w:instrText>
+    </w:r>
+    <w:r>
+      <w:rPr>
+        <w:rFonts w:ascii="Malgun Gothic" w:hAnsi="Malgun Gothic" w:eastAsia="Malgun Gothic" w:cs="Malgun Gothic"/>
+        <w:sz w:val="18"/>
+        <w:szCs w:val="18"/>
+        <w:lang w:val="en-US" w:eastAsia="ko-KR"/>
+      </w:rPr>
+      <w:fldChar w:fldCharType="separate"/>
+    </w:r>
+    <w:r>
+      <w:rPr>
+        <w:rFonts w:ascii="Malgun Gothic" w:hAnsi="Malgun Gothic" w:eastAsia="Malgun Gothic" w:cs="Malgun Gothic"/>
+        <w:sz w:val="18"/>
+        <w:szCs w:val="18"/>
+        <w:lang w:val="en-US" w:eastAsia="ko-KR"/>
+      </w:rPr>
+      <w:t/>
+    </w:r>
+    <w:r>
+      <w:rPr>
+        <w:rFonts w:ascii="Malgun Gothic" w:hAnsi="Malgun Gothic" w:eastAsia="Malgun Gothic" w:cs="Malgun Gothic"/>
+        <w:sz w:val="18"/>
+        <w:szCs w:val="18"/>
+        <w:lang w:val="en-US" w:eastAsia="ko-KR"/>
+      </w:rPr>
+      <w:fldChar w:fldCharType="end"/>
+    </w:r>
+  </w:p>
+</w:ftr>
 </file>
 
 <file path=word/footnotes.xml><?xml version="1.0" encoding="utf-8"?>
-<ns0:footnotes xmlns:ns0="http://schemas.openxmlformats.org/wordprocessingml/2006/main">
-  <ns0:footnote ns0:type="continuationSeparator" ns0:id="0">
-    <ns0:p>
-      <ns0:r>
-        <ns0:continuationSeparator/>
-      </ns0:r>
-    </ns0:p>
-  </ns0:footnote>
-  <ns0:footnote ns0:type="separator" ns0:id="-1">
-    <ns0:p>
-      <ns0:r>
-        <ns0:separator/>
-      </ns0:r>
-    </ns0:p>
-  </ns0:footnote>
-</ns0:footnotes>
+<w:footnotes xmlns:w="http://schemas.openxmlformats.org/wordprocessingml/2006/main">
+  <w:footnote w:type="continuationSeparator" w:id="0">
+    <w:p>
+      <w:r>
+        <w:continuationSeparator/>
+      </w:r>
+    </w:p>
+  </w:footnote>
+  <w:footnote w:type="separator" w:id="-1">
+    <w:p>
+      <w:r>
+        <w:separator/>
+      </w:r>
+    </w:p>
+  </w:footnote>
+</w:footnotes>
 </file>
 
 <file path=word/header1.xml><?xml version="1.0" encoding="utf-8"?>
-<ns0:hdr xmlns:ns0="http://schemas.openxmlformats.org/wordprocessingml/2006/main" xmlns:ns1="http://schemas.openxmlformats.org/markup-compatibility/2006" ns1:Ignorable="w14 wp14">
-  <ns0:p>
-    <ns0:pPr>
-      <ns0:pStyle ns0:val="Header"/>
-    </ns0:pPr>
-  </ns0:p>
-</ns0:hdr>
+<w:hdr xmlns:w="http://schemas.openxmlformats.org/wordprocessingml/2006/main">
+  <w:p>
+    <w:pPr>
+      <w:pStyle w:val="Header"/>
+    </w:pPr>
+  </w:p>
+</w:hdr>
 </file>
 
 <file path=word/numbering.xml><?xml version="1.0" encoding="utf-8"?>
@@ -414,11 +410,11 @@
     </w:pPr>
     <w:rPr>
       <w:rFonts w:ascii="Malgun Gothic" w:cs="Malgun Gothic" w:eastAsia="Malgun Gothic" w:hAnsi="Malgun Gothic"/>
-      <w:sz w:val="36"/>
-      <w:szCs w:val="36"/>
       <w:b w:val="true"/>
       <w:bCs w:val="true"/>
       <w:color w:val="000000"/>
+      <w:sz w:val="36"/>
+      <w:szCs w:val="36"/>
       <w:lang w:eastAsia="ko-KR" w:val="en-US"/>
     </w:rPr>
   </w:style>
@@ -451,10 +447,10 @@
     </w:pPr>
     <w:rPr>
       <w:rFonts w:ascii="Malgun Gothic" w:cs="Malgun Gothic" w:eastAsia="Malgun Gothic" w:hAnsi="Malgun Gothic"/>
+      <w:color w:val="333333"/>
       <w:spacing w:val="15"/>
       <w:sz w:val="22"/>
       <w:szCs w:val="22"/>
-      <w:color w:val="333333"/>
       <w:lang w:eastAsia="ko-KR" w:val="en-US"/>
     </w:rPr>
   </w:style>
@@ -570,11 +566,11 @@
     </w:pPr>
     <w:rPr>
       <w:rFonts w:ascii="Malgun Gothic" w:cs="Malgun Gothic" w:eastAsia="Malgun Gothic" w:hAnsi="Malgun Gothic"/>
+      <w:b w:val="true"/>
+      <w:bCs w:val="true"/>
       <w:color w:themeColor="accent1" w:themeShade="BF" w:val="000000"/>
       <w:sz w:val="32"/>
       <w:szCs w:val="32"/>
-      <w:b w:val="true"/>
-      <w:bCs w:val="true"/>
       <w:lang w:eastAsia="ko-KR" w:val="en-US"/>
     </w:rPr>
   </w:style>
@@ -596,11 +592,11 @@
     </w:pPr>
     <w:rPr>
       <w:rFonts w:ascii="Malgun Gothic" w:cs="Malgun Gothic" w:eastAsia="Malgun Gothic" w:hAnsi="Malgun Gothic"/>
+      <w:b w:val="true"/>
+      <w:bCs w:val="true"/>
       <w:color w:themeColor="accent1" w:themeShade="BF" w:val="000000"/>
       <w:sz w:val="26"/>
       <w:szCs w:val="26"/>
-      <w:b w:val="true"/>
-      <w:bCs w:val="true"/>
       <w:lang w:eastAsia="ko-KR" w:val="en-US"/>
     </w:rPr>
   </w:style>
@@ -622,11 +618,11 @@
     </w:pPr>
     <w:rPr>
       <w:rFonts w:ascii="Malgun Gothic" w:cs="Malgun Gothic" w:eastAsia="Malgun Gothic" w:hAnsi="Malgun Gothic"/>
+      <w:b w:val="true"/>
+      <w:bCs w:val="true"/>
       <w:color w:themeColor="accent1" w:themeShade="BF" w:val="000000"/>
       <w:sz w:val="24"/>
       <w:szCs w:val="24"/>
-      <w:b w:val="true"/>
-      <w:bCs w:val="true"/>
       <w:lang w:eastAsia="ko-KR" w:val="en-US"/>
     </w:rPr>
   </w:style>
@@ -648,13 +644,13 @@
     </w:pPr>
     <w:rPr>
       <w:rFonts w:ascii="Malgun Gothic" w:cs="Malgun Gothic" w:eastAsia="Malgun Gothic" w:hAnsi="Malgun Gothic"/>
+      <w:b w:val="true"/>
+      <w:bCs w:val="true"/>
       <w:i/>
       <w:iCs/>
       <w:color w:themeColor="accent1" w:themeShade="BF" w:val="000000"/>
       <w:sz w:val="22"/>
       <w:szCs w:val="22"/>
-      <w:b w:val="true"/>
-      <w:bCs w:val="true"/>
       <w:lang w:eastAsia="ko-KR" w:val="en-US"/>
     </w:rPr>
   </w:style>
@@ -676,11 +672,11 @@
     </w:pPr>
     <w:rPr>
       <w:rFonts w:ascii="Malgun Gothic" w:cs="Malgun Gothic" w:eastAsia="Malgun Gothic" w:hAnsi="Malgun Gothic"/>
+      <w:b w:val="true"/>
+      <w:bCs w:val="true"/>
       <w:color w:themeColor="accent1" w:themeShade="BF" w:val="000000"/>
       <w:sz w:val="22"/>
       <w:szCs w:val="22"/>
-      <w:b w:val="true"/>
-      <w:bCs w:val="true"/>
       <w:lang w:eastAsia="ko-KR" w:val="en-US"/>
     </w:rPr>
   </w:style>
@@ -702,13 +698,13 @@
     </w:pPr>
     <w:rPr>
       <w:rFonts w:ascii="Malgun Gothic" w:cs="Malgun Gothic" w:eastAsia="Malgun Gothic" w:hAnsi="Malgun Gothic"/>
+      <w:b w:val="true"/>
+      <w:bCs w:val="true"/>
       <w:i/>
       <w:iCs/>
       <w:color w:themeColor="text1" w:themeTint="A6" w:val="000000"/>
       <w:sz w:val="22"/>
       <w:szCs w:val="22"/>
-      <w:b w:val="true"/>
-      <w:bCs w:val="true"/>
       <w:lang w:eastAsia="ko-KR" w:val="en-US"/>
     </w:rPr>
   </w:style>
@@ -904,12 +900,12 @@
     <w:unhideWhenUsed/>
     <w:qFormat/>
     <w:pPr>
-      <w:spacing w:after="120" w:before="100" w:line="312" w:lineRule="auto"/>
-      <w:ind w:firstLine="0" w:left="480" w:right="480"/>
-      <w:shd w:color="auto" w:fill="F4F6F8" w:val="clear"/>
       <w:pBdr>
         <w:left w:color="5B7C99" w:space="8" w:sz="12" w:val="single"/>
       </w:pBdr>
+      <w:shd w:color="auto" w:fill="F4F6F8" w:val="clear"/>
+      <w:spacing w:after="120" w:before="100" w:line="312" w:lineRule="auto"/>
+      <w:ind w:firstLine="0" w:left="480" w:right="480"/>
     </w:pPr>
     <w:rPr>
       <w:rFonts w:ascii="Malgun Gothic" w:cs="Malgun Gothic" w:eastAsia="Malgun Gothic" w:hAnsi="Malgun Gothic"/>
@@ -1003,9 +999,9 @@
     </w:pPr>
     <w:rPr>
       <w:rFonts w:ascii="Malgun Gothic" w:cs="Malgun Gothic" w:eastAsia="Malgun Gothic" w:hAnsi="Malgun Gothic"/>
+      <w:color w:val="222222"/>
       <w:sz w:val="19"/>
       <w:szCs w:val="19"/>
-      <w:color w:val="222222"/>
       <w:lang w:eastAsia="ko-KR" w:val="en-US"/>
     </w:rPr>
   </w:style>
@@ -1121,10 +1117,10 @@
     </w:pPr>
     <w:rPr>
       <w:rFonts w:ascii="Malgun Gothic" w:cs="Malgun Gothic" w:eastAsia="Malgun Gothic" w:hAnsi="Malgun Gothic"/>
+      <w:b w:val="true"/>
+      <w:bCs w:val="true"/>
       <w:sz w:val="19"/>
       <w:szCs w:val="19"/>
-      <w:b w:val="true"/>
-      <w:bCs w:val="true"/>
       <w:lang w:eastAsia="ko-KR" w:val="en-US"/>
     </w:rPr>
   </w:style>
@@ -1366,7 +1362,7 @@
 </file>
 
 <file path=word/theme/theme1.xml><?xml version="1.0" encoding="utf-8"?>
-<a:theme xmlns:a="http://schemas.openxmlformats.org/drawingml/2006/main" name="Office Theme">
+<a:theme xmlns:ns_5011="http://schemas.microsoft.com/office/thememl/2012/main" xmlns:a="http://schemas.openxmlformats.org/drawingml/2006/main" name="Office Theme">
   <a:themeElements>
     <a:clrScheme name="Office">
       <a:dk1>
@@ -1654,7 +1650,7 @@
   <a:extraClrSchemeLst/>
   <a:extLst>
     <a:ext uri="{05A4C25C-085E-4340-85A3-A5531E510DB2}">
-      <thm15:themeFamily xmlns:thm15="http://schemas.microsoft.com/office/thememl/2012/main" name="Office Theme" id="{2E142A2C-CD16-42D6-873A-C26D2A0506FA}" vid="{1BDDFF52-6CD6-40A5-AB3C-68EB2F1E4D0A}"/>
+      <ns_5011:themeFamily name="Office Theme" id="{2E142A2C-CD16-42D6-873A-C26D2A0506FA}" vid="{1BDDFF52-6CD6-40A5-AB3C-68EB2F1E4D0A}"/>
     </a:ext>
   </a:extLst>
 </a:theme>

</xml_diff>